<commit_message>
Thuc hanh Buoi 7: Hoan thanh clone UI mau Tech Mart, responsive FlatList va bao cao (12523080)
</commit_message>
<xml_diff>
--- a/Luyện Tập 7/BuiDuyThanh_LuyenTap7.docx
+++ b/Luyện Tập 7/BuiDuyThanh_LuyenTap7.docx
@@ -4,7 +4,7 @@
   <w:body>
     <w:p>
       <w:pPr>
-        <w:spacing w:after="80"/>
+        <w:spacing w:after="60"/>
         <w:jc w:val="center"/>
       </w:pPr>
       <w:r>
@@ -14,7 +14,7 @@
           <w:color w:val="1E3A8A"/>
           <w:sz w:val="36"/>
         </w:rPr>
-        <w:t>BÀI TẬP LUYỆN TẬP TUẦN 7</w:t>
+        <w:t>BÁI TẬP BÁO CÁO VÀ THỰC HÀNH TUẦN 7</w:t>
       </w:r>
     </w:p>
     <w:p>
@@ -29,12 +29,12 @@
           <w:color w:val="475569"/>
           <w:sz w:val="26"/>
         </w:rPr>
-        <w:t>VÒNG ĐỜI, CONTROLLED COMPONENT &amp; LỒNG COMPONENT TRONG REACT NATIVE</w:t>
+        <w:t>CHƯƠNG 3: VÒNG ĐỜI, CONTROLLED COMPONENT &amp; THỰC HÀNH CLONE UI RESPONSIVE</w:t>
       </w:r>
     </w:p>
     <w:p>
       <w:pPr>
-        <w:spacing w:after="200"/>
+        <w:spacing w:after="160"/>
         <w:jc w:val="center"/>
       </w:pPr>
       <w:r>
@@ -44,7 +44,7 @@
           <w:color w:val="64748B"/>
           <w:sz w:val="22"/>
         </w:rPr>
-        <w:t>Chương 3: Component trong React Native (Mục 3.4 - 3.6)</w:t>
+        <w:t>Môn học: Phát triển ứng dụng Mobile đa nền tảng | Git Tag: buoi7</w:t>
       </w:r>
     </w:p>
     <w:tbl>
@@ -68,9 +68,8 @@
               <w:rPr>
                 <w:rFonts w:ascii="Times New Roman" w:hAnsi="Times New Roman"/>
                 <w:b/>
-                <w:sz w:val="21"/>
               </w:rPr>
-              <w:t>Họ và tên</w:t>
+              <w:t>Họ và tên sinh viên</w:t>
             </w:r>
           </w:p>
         </w:tc>
@@ -82,7 +81,6 @@
             <w:r>
               <w:rPr>
                 <w:rFonts w:ascii="Times New Roman" w:hAnsi="Times New Roman"/>
-                <w:sz w:val="21"/>
               </w:rPr>
               <w:t>Bùi Duy Thành</w:t>
             </w:r>
@@ -100,7 +98,6 @@
               <w:rPr>
                 <w:rFonts w:ascii="Times New Roman" w:hAnsi="Times New Roman"/>
                 <w:b/>
-                <w:sz w:val="21"/>
               </w:rPr>
               <w:t>Mã sinh viên</w:t>
             </w:r>
@@ -114,7 +111,6 @@
             <w:r>
               <w:rPr>
                 <w:rFonts w:ascii="Times New Roman" w:hAnsi="Times New Roman"/>
-                <w:sz w:val="21"/>
               </w:rPr>
               <w:t>12523080</w:t>
             </w:r>
@@ -132,9 +128,8 @@
               <w:rPr>
                 <w:rFonts w:ascii="Times New Roman" w:hAnsi="Times New Roman"/>
                 <w:b/>
-                <w:sz w:val="21"/>
               </w:rPr>
-              <w:t>Lớp</w:t>
+              <w:t>Lớp chuyên ngành</w:t>
             </w:r>
           </w:p>
         </w:tc>
@@ -146,7 +141,6 @@
             <w:r>
               <w:rPr>
                 <w:rFonts w:ascii="Times New Roman" w:hAnsi="Times New Roman"/>
-                <w:sz w:val="21"/>
               </w:rPr>
               <w:t>12523W.3</w:t>
             </w:r>
@@ -164,9 +158,8 @@
               <w:rPr>
                 <w:rFonts w:ascii="Times New Roman" w:hAnsi="Times New Roman"/>
                 <w:b/>
-                <w:sz w:val="21"/>
               </w:rPr>
-              <w:t>Ngày hoàn thành</w:t>
+              <w:t>Nhiệm vụ thực hành</w:t>
             </w:r>
           </w:p>
         </w:tc>
@@ -178,9 +171,38 @@
             <w:r>
               <w:rPr>
                 <w:rFonts w:ascii="Times New Roman" w:hAnsi="Times New Roman"/>
-                <w:sz w:val="21"/>
               </w:rPr>
-              <w:t>17/10/2026</w:t>
+              <w:t>Clone UI mẫu Home E-commerce + Responsive + Tối ưu FlatList</w:t>
+            </w:r>
+          </w:p>
+        </w:tc>
+      </w:tr>
+      <w:tr>
+        <w:tc>
+          <w:tcPr>
+            <w:tcW w:type="dxa" w:w="2592"/>
+            <w:shd w:fill="F8FAFC"/>
+          </w:tcPr>
+          <w:p>
+            <w:r>
+              <w:rPr>
+                <w:rFonts w:ascii="Times New Roman" w:hAnsi="Times New Roman"/>
+                <w:b/>
+              </w:rPr>
+              <w:t>Git Tag nộp bài</w:t>
+            </w:r>
+          </w:p>
+        </w:tc>
+        <w:tc>
+          <w:tcPr>
+            <w:tcW w:type="dxa" w:w="6480"/>
+          </w:tcPr>
+          <w:p>
+            <w:r>
+              <w:rPr>
+                <w:rFonts w:ascii="Times New Roman" w:hAnsi="Times New Roman"/>
+              </w:rPr>
+              <w:t>buoi7</w:t>
             </w:r>
           </w:p>
         </w:tc>
@@ -193,7 +215,7 @@
     </w:p>
     <w:p>
       <w:pPr>
-        <w:spacing w:before="280" w:after="80"/>
+        <w:spacing w:before="240" w:after="80"/>
       </w:pPr>
       <w:r>
         <w:rPr>
@@ -202,12 +224,12 @@
           <w:color w:val="1E3A8A"/>
           <w:sz w:val="27"/>
         </w:rPr>
-        <w:t>PHẦN A. CÂU HỎI ÔN TẬP LÝ THUYẾT</w:t>
+        <w:t>PHẦN A. CÂU HỎI ÔN TẬP LÝ THUYẾT (MỤC 3.4 - 3.6)</w:t>
       </w:r>
     </w:p>
     <w:p>
       <w:pPr>
-        <w:spacing w:before="200" w:after="60"/>
+        <w:spacing w:before="160" w:after="60"/>
       </w:pPr>
       <w:r>
         <w:rPr>
@@ -216,7 +238,7 @@
           <w:color w:val="0F172A"/>
           <w:sz w:val="24"/>
         </w:rPr>
-        <w:t>Câu 1. Trình tự hoạt động (Vòng đời - Lifecycle) của một Component trong React Native</w:t>
+        <w:t>1. Trình tự hoạt động của Component (Lifecycle) trong React Native</w:t>
       </w:r>
     </w:p>
     <w:p>
@@ -230,7 +252,7 @@
           <w:color w:val="334155"/>
           <w:sz w:val="22"/>
         </w:rPr>
-        <w:t>Một component React Native trải qua một chu trình hoạt động (lifecycle) gồm 3 giai đoạn chính:</w:t>
+        <w:t>Vòng đời (Lifecycle) là chuỗi các giai đoạn mà một component trải qua từ khi khởi tạo đến khi bị gỡ bỏ:</w:t>
       </w:r>
     </w:p>
     <w:p>
@@ -245,7 +267,7 @@
           <w:color w:val="0F172A"/>
           <w:sz w:val="22"/>
         </w:rPr>
-        <w:t xml:space="preserve">1. Gắn kết (Mounting): </w:t>
+        <w:t xml:space="preserve">Mounting (Gắn kết): </w:t>
       </w:r>
       <w:r>
         <w:rPr>
@@ -253,7 +275,7 @@
           <w:color w:val="334155"/>
           <w:sz w:val="22"/>
         </w:rPr>
-        <w:t>Đây là giai đoạn component được khởi tạo và chèn vào cây giao diện (Virtual DOM). Trong Class Component, constructor() khởi tạo state và binding; render() trả về JSX; componentDidMount() được gọi ngay sau khi component hiển thị lần đầu tiên, là nơi thích hợp để gọi API hoặc thiết lập timers. Trong Functional Component, giai đoạn này được biểu diễn tương đương bằng hook useEffect với dependency array rỗng ([]).</w:t>
+        <w:t>Khởi tạo và đưa component vào Virtual DOM. Trong Functional Component dùng useEffect(() =&gt; {...}, []) với dependency rỗng, chỉ chạy 1 lần duy nhất sau render đầu tiên để gọi API hoặc thiết lập timer.</w:t>
       </w:r>
     </w:p>
     <w:p>
@@ -268,7 +290,7 @@
           <w:color w:val="0F172A"/>
           <w:sz w:val="22"/>
         </w:rPr>
-        <w:t xml:space="preserve">2. Cập nhật (Updating): </w:t>
+        <w:t xml:space="preserve">Updating (Cập nhật): </w:t>
       </w:r>
       <w:r>
         <w:rPr>
@@ -276,7 +298,7 @@
           <w:color w:val="334155"/>
           <w:sz w:val="22"/>
         </w:rPr>
-        <w:t>Giai đoạn component được render lại do sự thay đổi của props hoặc state. Trong Class Component có shouldComponentUpdate() giúp tối ưu hiệu năng, render() chạy lại và componentDidUpdate() nhận biết sự thay đổi. Trong Functional Component, useEffect với dependency array [deps] sẽ kích hoạt lại mỗi khi bất kỳ giá trị dependency nào thay đổi.</w:t>
+        <w:t>Kích hoạt khi props hoặc state thay đổi khiến giao diện re-render. Dùng useEffect(..., [deps]) chạy mỗi khi dependencies chỉ định thay đổi giá trị.</w:t>
       </w:r>
     </w:p>
     <w:p>
@@ -291,7 +313,7 @@
           <w:color w:val="0F172A"/>
           <w:sz w:val="22"/>
         </w:rPr>
-        <w:t xml:space="preserve">3. Tháo gỡ (Unmounting): </w:t>
+        <w:t xml:space="preserve">Unmounting (Tháo gỡ): </w:t>
       </w:r>
       <w:r>
         <w:rPr>
@@ -299,12 +321,12 @@
           <w:color w:val="334155"/>
           <w:sz w:val="22"/>
         </w:rPr>
-        <w:t>Giai đoạn component bị xóa khỏi cây giao diện. Trong Class Component, componentWillUnmount() được gọi ngay trước khi bị xóa để hủy timers, hủy subscriptions. Trong Functional Component, cleanup function được trả về từ useEffect (return () =&gt; { ... }) sẽ được gọi trước lần render tiếp theo hoặc khi component bị unmount.</w:t>
+        <w:t>Loại bỏ component khỏi DOM. Dùng cleanup function (return () =&gt; {...}) trong useEffect để dọn dẹp timers, hủy kết nối socket và tránh rò rỉ bộ nhớ.</w:t>
       </w:r>
     </w:p>
     <w:p>
       <w:pPr>
-        <w:spacing w:before="200" w:after="60"/>
+        <w:spacing w:before="160" w:after="60"/>
       </w:pPr>
       <w:r>
         <w:rPr>
@@ -313,7 +335,7 @@
           <w:color w:val="0F172A"/>
           <w:sz w:val="24"/>
         </w:rPr>
-        <w:t>Câu 2. So sánh cơ chế Vòng đời giữa Class Component và Functional Component</w:t>
+        <w:t>2. Controlled Component trong React Native</w:t>
       </w:r>
     </w:p>
     <w:p>
@@ -327,7 +349,425 @@
           <w:color w:val="334155"/>
           <w:sz w:val="22"/>
         </w:rPr>
-        <w:t>Với sự ra đời của Hooks trong React 16.8, Functional Component đã thay thế Class Component trở thành tiêu chuẩn phát triển hiện đại:</w:t>
+        <w:t>Controlled Component là component nhập liệu (ví dụ TextInput) mà dữ liệu hiển thị hoàn toàn do React state kiểm soát và làm nguồn chân lý duy nhất (Single Source of Truth).</w:t>
+      </w:r>
+    </w:p>
+    <w:p>
+      <w:pPr>
+        <w:pStyle w:val="ListBullet"/>
+        <w:spacing w:after="60" w:line="276" w:lineRule="auto"/>
+      </w:pPr>
+      <w:r>
+        <w:rPr>
+          <w:rFonts w:ascii="Times New Roman" w:hAnsi="Times New Roman"/>
+          <w:b/>
+          <w:color w:val="0F172A"/>
+          <w:sz w:val="22"/>
+        </w:rPr>
+        <w:t xml:space="preserve">Cơ chế hoạt động: </w:t>
+      </w:r>
+      <w:r>
+        <w:rPr>
+          <w:rFonts w:ascii="Times New Roman" w:hAnsi="Times New Roman"/>
+          <w:color w:val="334155"/>
+          <w:sz w:val="22"/>
+        </w:rPr>
+        <w:t>Gán value={state} và onChangeText={setState} để tạo liên kết đồng bộ hai chiều.</w:t>
+      </w:r>
+    </w:p>
+    <w:p>
+      <w:pPr>
+        <w:pStyle w:val="ListBullet"/>
+        <w:spacing w:after="60" w:line="276" w:lineRule="auto"/>
+      </w:pPr>
+      <w:r>
+        <w:rPr>
+          <w:rFonts w:ascii="Times New Roman" w:hAnsi="Times New Roman"/>
+          <w:b/>
+          <w:color w:val="0F172A"/>
+          <w:sz w:val="22"/>
+        </w:rPr>
+        <w:t xml:space="preserve">Lợi ích thực tiễn: </w:t>
+      </w:r>
+      <w:r>
+        <w:rPr>
+          <w:rFonts w:ascii="Times New Roman" w:hAnsi="Times New Roman"/>
+          <w:color w:val="334155"/>
+          <w:sz w:val="22"/>
+        </w:rPr>
+        <w:t>Dễ dàng kiểm tra tính hợp lệ dữ liệu theo thời gian thực (Real-time Validation), chuẩn hóa dữ liệu đầu vào, bật/tắt nút gửi và tạo nút xóa nhanh (Clear).</w:t>
+      </w:r>
+    </w:p>
+    <w:p>
+      <w:pPr>
+        <w:spacing w:before="160" w:after="60"/>
+      </w:pPr>
+      <w:r>
+        <w:rPr>
+          <w:rFonts w:ascii="Times New Roman" w:hAnsi="Times New Roman"/>
+          <w:b/>
+          <w:color w:val="0F172A"/>
+          <w:sz w:val="24"/>
+        </w:rPr>
+        <w:t>3. Kỹ thuật Lồng Component (Nested Component)</w:t>
+      </w:r>
+    </w:p>
+    <w:p>
+      <w:pPr>
+        <w:spacing w:after="80" w:line="276" w:lineRule="auto"/>
+      </w:pPr>
+      <w:r>
+        <w:rPr>
+          <w:rFonts w:ascii="Times New Roman" w:hAnsi="Times New Roman"/>
+          <w:i w:val="0"/>
+          <w:color w:val="334155"/>
+          <w:sz w:val="22"/>
+        </w:rPr>
+        <w:t>Kỹ thuật nhúng một hoặc nhiều component con vào component cha, quản lý luồng dữ liệu 1 chiều thông qua props. Giúp code được module hóa, dễ tái sử dụng và kiểm thử độc lập.</w:t>
+      </w:r>
+    </w:p>
+    <w:p>
+      <w:pPr>
+        <w:spacing w:before="240" w:after="80"/>
+      </w:pPr>
+      <w:r>
+        <w:rPr>
+          <w:rFonts w:ascii="Times New Roman" w:hAnsi="Times New Roman"/>
+          <w:b/>
+          <w:color w:val="1E3A8A"/>
+          <w:sz w:val="27"/>
+        </w:rPr>
+        <w:t>PHẦN B. BÀI TẬP THỰC HÀNH: CLONE UI MẪU + RESPONSIVE (BUỔI 07)</w:t>
+      </w:r>
+    </w:p>
+    <w:p>
+      <w:pPr>
+        <w:spacing w:after="80" w:line="276" w:lineRule="auto"/>
+      </w:pPr>
+      <w:r>
+        <w:rPr>
+          <w:rFonts w:ascii="Times New Roman" w:hAnsi="Times New Roman"/>
+          <w:i w:val="0"/>
+          <w:color w:val="334155"/>
+          <w:sz w:val="22"/>
+        </w:rPr>
+        <w:t>Thực hiện đầy đủ theo nhiệm vụ yêu cầu trong slide bài học:</w:t>
+      </w:r>
+    </w:p>
+    <w:p>
+      <w:pPr>
+        <w:pStyle w:val="ListBullet"/>
+        <w:spacing w:after="60" w:line="276" w:lineRule="auto"/>
+      </w:pPr>
+      <w:r>
+        <w:rPr>
+          <w:rFonts w:ascii="Times New Roman" w:hAnsi="Times New Roman"/>
+          <w:b/>
+          <w:color w:val="0F172A"/>
+          <w:sz w:val="22"/>
+        </w:rPr>
+        <w:t xml:space="preserve">1. Clone UI mẫu: </w:t>
+      </w:r>
+      <w:r>
+        <w:rPr>
+          <w:rFonts w:ascii="Times New Roman" w:hAnsi="Times New Roman"/>
+          <w:color w:val="334155"/>
+          <w:sz w:val="22"/>
+        </w:rPr>
+        <w:t>Xây dựng màn hình Home Tech Mart Pro với phong cách E-commerce hiện đại, bố cục dạng lưới, khoảng cách spacing (8pt/16pt grid) khoa học.</w:t>
+      </w:r>
+    </w:p>
+    <w:p>
+      <w:pPr>
+        <w:pStyle w:val="ListBullet"/>
+        <w:spacing w:after="60" w:line="276" w:lineRule="auto"/>
+      </w:pPr>
+      <w:r>
+        <w:rPr>
+          <w:rFonts w:ascii="Times New Roman" w:hAnsi="Times New Roman"/>
+          <w:b/>
+          <w:color w:val="0F172A"/>
+          <w:sz w:val="22"/>
+        </w:rPr>
+        <w:t xml:space="preserve">2. Áp dụng SafeAreaView: </w:t>
+      </w:r>
+      <w:r>
+        <w:rPr>
+          <w:rFonts w:ascii="Times New Roman" w:hAnsi="Times New Roman"/>
+          <w:color w:val="334155"/>
+          <w:sz w:val="22"/>
+        </w:rPr>
+        <w:t>Bọc toàn bộ màn hình bằng SafeAreaView để nội dung không bị tai thỏ, camera nốt ruồi hay thanh điều hướng hệ thống che khuất.</w:t>
+      </w:r>
+    </w:p>
+    <w:p>
+      <w:pPr>
+        <w:pStyle w:val="ListBullet"/>
+        <w:spacing w:after="60" w:line="276" w:lineRule="auto"/>
+      </w:pPr>
+      <w:r>
+        <w:rPr>
+          <w:rFonts w:ascii="Times New Roman" w:hAnsi="Times New Roman"/>
+          <w:b/>
+          <w:color w:val="0F172A"/>
+          <w:sz w:val="22"/>
+        </w:rPr>
+        <w:t xml:space="preserve">3. Header cố định: </w:t>
+      </w:r>
+      <w:r>
+        <w:rPr>
+          <w:rFonts w:ascii="Times New Roman" w:hAnsi="Times New Roman"/>
+          <w:color w:val="334155"/>
+          <w:sz w:val="22"/>
+        </w:rPr>
+        <w:t>Tạo component FixedHeader với thuộc tính position: absolute, zIndex: 100 ghim chắc chắn trên đỉnh màn hình.</w:t>
+      </w:r>
+    </w:p>
+    <w:p>
+      <w:pPr>
+        <w:pStyle w:val="ListBullet"/>
+        <w:spacing w:after="60" w:line="276" w:lineRule="auto"/>
+      </w:pPr>
+      <w:r>
+        <w:rPr>
+          <w:rFonts w:ascii="Times New Roman" w:hAnsi="Times New Roman"/>
+          <w:b/>
+          <w:color w:val="0F172A"/>
+          <w:sz w:val="22"/>
+        </w:rPr>
+        <w:t xml:space="preserve">4. Tối ưu FlatList: </w:t>
+      </w:r>
+      <w:r>
+        <w:rPr>
+          <w:rFonts w:ascii="Times New Roman" w:hAnsi="Times New Roman"/>
+          <w:color w:val="334155"/>
+          <w:sz w:val="22"/>
+        </w:rPr>
+        <w:t>Sử dụng keyExtractor duy nhất đảm bảo không cảnh báo key warning; renderItem được tách riêng thành component ProductCard.js độc lập.</w:t>
+      </w:r>
+    </w:p>
+    <w:p>
+      <w:pPr>
+        <w:pStyle w:val="ListBullet"/>
+        <w:spacing w:after="60" w:line="276" w:lineRule="auto"/>
+      </w:pPr>
+      <w:r>
+        <w:rPr>
+          <w:rFonts w:ascii="Times New Roman" w:hAnsi="Times New Roman"/>
+          <w:b/>
+          <w:color w:val="0F172A"/>
+          <w:sz w:val="22"/>
+        </w:rPr>
+        <w:t xml:space="preserve">5. Kiểm tra Responsive: </w:t>
+      </w:r>
+      <w:r>
+        <w:rPr>
+          <w:rFonts w:ascii="Times New Roman" w:hAnsi="Times New Roman"/>
+          <w:color w:val="334155"/>
+          <w:sz w:val="22"/>
+        </w:rPr>
+        <w:t>Sử dụng hook useWindowDimensions() tự động chuyển đổi giữa 1 cột (Dọc - Portrait) và 2 cột (Ngang - Landscape). Hỗ trợ nút chuyển nhanh chế độ xem để kiểm thử tức thì.</w:t>
+      </w:r>
+    </w:p>
+    <w:p>
+      <w:pPr>
+        <w:spacing w:before="160" w:after="60"/>
+      </w:pPr>
+      <w:r>
+        <w:rPr>
+          <w:rFonts w:ascii="Times New Roman" w:hAnsi="Times New Roman"/>
+          <w:b/>
+          <w:color w:val="0F172A"/>
+          <w:sz w:val="24"/>
+        </w:rPr>
+        <w:t>Mã nguồn các Component chính</w:t>
+      </w:r>
+    </w:p>
+    <w:p>
+      <w:pPr>
+        <w:spacing w:before="60" w:after="100"/>
+        <w:ind w:left="288"/>
+        <w:shd w:fill="F1F5F9"/>
+      </w:pPr>
+      <w:r>
+        <w:rPr>
+          <w:rFonts w:ascii="Consolas" w:hAnsi="Consolas"/>
+          <w:color w:val="1E293B"/>
+          <w:sz w:val="19"/>
+        </w:rPr>
+        <w:t>// 1. Tối ưu FlatList và Responsive (Luyện Tập 7/App.js)</w:t>
+        <w:br/>
+        <w:t>const { width, height } = useWindowDimensions();</w:t>
+        <w:br/>
+        <w:t>const numColumns = (width &gt; height || width &gt;= 600) ? 2 : 1;</w:t>
+        <w:br/>
+        <w:t>const cardWidth = numColumns &gt; 1 ? (width - 44) / 2 : width - 32;</w:t>
+        <w:br/>
+        <w:br/>
+        <w:t>&lt;FlatList</w:t>
+        <w:br/>
+        <w:t xml:space="preserve">  key={`flatlist_cols_${numColumns}`}</w:t>
+        <w:br/>
+        <w:t xml:space="preserve">  data={filteredProducts}</w:t>
+        <w:br/>
+        <w:t xml:space="preserve">  keyExtractor={(item) =&gt; item.id.toString()}</w:t>
+        <w:br/>
+        <w:t xml:space="preserve">  renderItem={({ item }) =&gt; &lt;ProductCard item={item} cardWidth={cardWidth} /&gt;}</w:t>
+        <w:br/>
+        <w:t xml:space="preserve">  numColumns={numColumns}</w:t>
+        <w:br/>
+        <w:t xml:space="preserve">  contentContainerStyle={{ paddingTop: 105, paddingBottom: 40 }}</w:t>
+        <w:br/>
+        <w:t>/&gt;</w:t>
+        <w:br/>
+      </w:r>
+    </w:p>
+    <w:p>
+      <w:pPr>
+        <w:spacing w:before="160" w:after="60"/>
+      </w:pPr>
+      <w:r>
+        <w:rPr>
+          <w:rFonts w:ascii="Times New Roman" w:hAnsi="Times New Roman"/>
+          <w:b/>
+          <w:color w:val="0F172A"/>
+          <w:sz w:val="24"/>
+        </w:rPr>
+        <w:t>Hình ảnh kết quả thực nghiệm ứng dụng</w:t>
+      </w:r>
+    </w:p>
+    <w:p>
+      <w:pPr>
+        <w:spacing w:after="80" w:line="276" w:lineRule="auto"/>
+      </w:pPr>
+      <w:r>
+        <w:rPr>
+          <w:rFonts w:ascii="Times New Roman" w:hAnsi="Times New Roman"/>
+          <w:i w:val="0"/>
+          <w:color w:val="334155"/>
+          <w:sz w:val="22"/>
+        </w:rPr>
+        <w:t>Ứng dụng đã được kiểm thử và chụp ảnh màn hình minh chứng đầy đủ trên 2 kích thước màn hình / chiều hiển thị:</w:t>
+      </w:r>
+    </w:p>
+    <w:p>
+      <w:pPr>
+        <w:jc w:val="center"/>
+      </w:pPr>
+    </w:p>
+    <w:p>
+      <w:r>
+        <w:drawing>
+          <wp:inline xmlns:a="http://schemas.openxmlformats.org/drawingml/2006/main" xmlns:pic="http://schemas.openxmlformats.org/drawingml/2006/picture">
+            <wp:extent cx="2194560" cy="4761079"/>
+            <wp:docPr id="1" name="Picture 1"/>
+            <wp:cNvGraphicFramePr>
+              <a:graphicFrameLocks noChangeAspect="1"/>
+            </wp:cNvGraphicFramePr>
+            <a:graphic>
+              <a:graphicData uri="http://schemas.openxmlformats.org/drawingml/2006/picture">
+                <pic:pic>
+                  <pic:nvPicPr>
+                    <pic:cNvPr id="0" name="screenshot_buoi7.png"/>
+                    <pic:cNvPicPr/>
+                  </pic:nvPicPr>
+                  <pic:blipFill>
+                    <a:blip r:embed="rId9"/>
+                    <a:stretch>
+                      <a:fillRect/>
+                    </a:stretch>
+                  </pic:blipFill>
+                  <pic:spPr>
+                    <a:xfrm>
+                      <a:off x="0" y="0"/>
+                      <a:ext cx="2194560" cy="4761079"/>
+                    </a:xfrm>
+                    <a:prstGeom prst="rect"/>
+                  </pic:spPr>
+                </pic:pic>
+              </a:graphicData>
+            </a:graphic>
+          </wp:inline>
+        </w:drawing>
+      </w:r>
+    </w:p>
+    <w:p>
+      <w:pPr>
+        <w:jc w:val="center"/>
+      </w:pPr>
+      <w:r>
+        <w:rPr>
+          <w:i/>
+          <w:sz w:val="20"/>
+        </w:rPr>
+        <w:t>Hình 1: Chế độ dọc (Portrait 1 cột) với Fixed Header, SearchBar và FlatList</w:t>
+      </w:r>
+    </w:p>
+    <w:p>
+      <w:pPr>
+        <w:jc w:val="center"/>
+      </w:pPr>
+    </w:p>
+    <w:p>
+      <w:r>
+        <w:drawing>
+          <wp:inline xmlns:a="http://schemas.openxmlformats.org/drawingml/2006/main" xmlns:pic="http://schemas.openxmlformats.org/drawingml/2006/picture">
+            <wp:extent cx="4572000" cy="2455664"/>
+            <wp:docPr id="2" name="Picture 2"/>
+            <wp:cNvGraphicFramePr>
+              <a:graphicFrameLocks noChangeAspect="1"/>
+            </wp:cNvGraphicFramePr>
+            <a:graphic>
+              <a:graphicData uri="http://schemas.openxmlformats.org/drawingml/2006/picture">
+                <pic:pic>
+                  <pic:nvPicPr>
+                    <pic:cNvPr id="0" name="screenshot_buoi7_landscape.png"/>
+                    <pic:cNvPicPr/>
+                  </pic:nvPicPr>
+                  <pic:blipFill>
+                    <a:blip r:embed="rId10"/>
+                    <a:stretch>
+                      <a:fillRect/>
+                    </a:stretch>
+                  </pic:blipFill>
+                  <pic:spPr>
+                    <a:xfrm>
+                      <a:off x="0" y="0"/>
+                      <a:ext cx="4572000" cy="2455664"/>
+                    </a:xfrm>
+                    <a:prstGeom prst="rect"/>
+                  </pic:spPr>
+                </pic:pic>
+              </a:graphicData>
+            </a:graphic>
+          </wp:inline>
+        </w:drawing>
+      </w:r>
+    </w:p>
+    <w:p>
+      <w:pPr>
+        <w:jc w:val="center"/>
+      </w:pPr>
+      <w:r>
+        <w:rPr>
+          <w:i/>
+          <w:sz w:val="20"/>
+        </w:rPr>
+        <w:t>Hình 2: Chế độ xoay ngang (Landscape 2 cột) chứng minh tính Responsive linh hoạt</w:t>
+      </w:r>
+    </w:p>
+    <w:p>
+      <w:pPr>
+        <w:spacing w:before="160" w:after="60"/>
+      </w:pPr>
+      <w:r>
+        <w:rPr>
+          <w:rFonts w:ascii="Times New Roman" w:hAnsi="Times New Roman"/>
+          <w:b/>
+          <w:color w:val="0F172A"/>
+          <w:sz w:val="24"/>
+        </w:rPr>
+        <w:t>Bảng đối chiếu tiêu chí đánh giá Buổi 07</w:t>
       </w:r>
     </w:p>
     <w:tbl>
@@ -348,17 +788,13 @@
             <w:shd w:fill="E2E8F0"/>
           </w:tcPr>
           <w:p>
-            <w:pPr>
-              <w:spacing w:line="276" w:lineRule="auto" w:after="40"/>
-            </w:pPr>
             <w:r>
               <w:rPr>
                 <w:rFonts w:ascii="Times New Roman" w:hAnsi="Times New Roman"/>
                 <w:b/>
-                <w:color w:val="1E3A8A"/>
                 <w:sz w:val="19"/>
               </w:rPr>
-              <w:t>Giai đoạn / Tiêu chí</w:t>
+              <w:t>Tiêu chí yêu cầu</w:t>
             </w:r>
           </w:p>
         </w:tc>
@@ -368,17 +804,13 @@
             <w:shd w:fill="E2E8F0"/>
           </w:tcPr>
           <w:p>
-            <w:pPr>
-              <w:spacing w:line="276" w:lineRule="auto" w:after="40"/>
-            </w:pPr>
             <w:r>
               <w:rPr>
                 <w:rFonts w:ascii="Times New Roman" w:hAnsi="Times New Roman"/>
                 <w:b/>
-                <w:color w:val="1E3A8A"/>
                 <w:sz w:val="19"/>
               </w:rPr>
-              <w:t>Class Component (Cũ)</w:t>
+              <w:t>Yêu cầu trong Slide</w:t>
             </w:r>
           </w:p>
         </w:tc>
@@ -388,17 +820,13 @@
             <w:shd w:fill="E2E8F0"/>
           </w:tcPr>
           <w:p>
-            <w:pPr>
-              <w:spacing w:line="276" w:lineRule="auto" w:after="40"/>
-            </w:pPr>
             <w:r>
               <w:rPr>
                 <w:rFonts w:ascii="Times New Roman" w:hAnsi="Times New Roman"/>
                 <w:b/>
-                <w:color w:val="1E3A8A"/>
                 <w:sz w:val="19"/>
               </w:rPr>
-              <w:t>Functional Component + Hooks (Hiện đại)</w:t>
+              <w:t>Kết quả thực hiện</w:t>
             </w:r>
           </w:p>
         </w:tc>
@@ -409,16 +837,12 @@
             <w:tcW w:type="dxa" w:w="3312"/>
           </w:tcPr>
           <w:p>
-            <w:pPr>
-              <w:spacing w:line="276" w:lineRule="auto" w:after="40"/>
-            </w:pPr>
             <w:r>
               <w:rPr>
                 <w:rFonts w:ascii="Times New Roman" w:hAnsi="Times New Roman"/>
-                <w:b/>
                 <w:sz w:val="19"/>
               </w:rPr>
-              <w:t>Khởi tạo state</w:t>
+              <w:t>Clone UI mẫu</w:t>
             </w:r>
           </w:p>
         </w:tc>
@@ -427,15 +851,12 @@
             <w:tcW w:type="dxa" w:w="3312"/>
           </w:tcPr>
           <w:p>
-            <w:pPr>
-              <w:spacing w:line="276" w:lineRule="auto" w:after="40"/>
-            </w:pPr>
             <w:r>
               <w:rPr>
                 <w:rFonts w:ascii="Times New Roman" w:hAnsi="Times New Roman"/>
                 <w:sz w:val="19"/>
               </w:rPr>
-              <w:t>Khai báo trong constructor(props): this.state = {...}</w:t>
+              <w:t>Chọn Home/Detail, clone UI spacing rõ ràng.</w:t>
             </w:r>
           </w:p>
         </w:tc>
@@ -444,15 +865,12 @@
             <w:tcW w:type="dxa" w:w="3312"/>
           </w:tcPr>
           <w:p>
-            <w:pPr>
-              <w:spacing w:line="276" w:lineRule="auto" w:after="40"/>
-            </w:pPr>
             <w:r>
               <w:rPr>
                 <w:rFonts w:ascii="Times New Roman" w:hAnsi="Times New Roman"/>
                 <w:sz w:val="19"/>
               </w:rPr>
-              <w:t>Dùng hook useState(initialValue) linh hoạt, tách biệt.</w:t>
+              <w:t>Đạt: Giao diện Home Tech Mart Pro hiện đại, spacing chuẩn.</w:t>
             </w:r>
           </w:p>
         </w:tc>
@@ -463,16 +881,12 @@
             <w:tcW w:type="dxa" w:w="3312"/>
           </w:tcPr>
           <w:p>
-            <w:pPr>
-              <w:spacing w:line="276" w:lineRule="auto" w:after="40"/>
-            </w:pPr>
             <w:r>
               <w:rPr>
                 <w:rFonts w:ascii="Times New Roman" w:hAnsi="Times New Roman"/>
-                <w:b/>
                 <w:sz w:val="19"/>
               </w:rPr>
-              <w:t>Mounting (Gắn kết)</w:t>
+              <w:t>SafeAreaView</w:t>
             </w:r>
           </w:p>
         </w:tc>
@@ -481,15 +895,12 @@
             <w:tcW w:type="dxa" w:w="3312"/>
           </w:tcPr>
           <w:p>
-            <w:pPr>
-              <w:spacing w:line="276" w:lineRule="auto" w:after="40"/>
-            </w:pPr>
             <w:r>
               <w:rPr>
                 <w:rFonts w:ascii="Times New Roman" w:hAnsi="Times New Roman"/>
                 <w:sz w:val="19"/>
               </w:rPr>
-              <w:t>Phương thức componentDidMount() chạy 1 lần sau render đầu tiên.</w:t>
+              <w:t>Tránh nội dung bị tai thỏ che.</w:t>
             </w:r>
           </w:p>
         </w:tc>
@@ -498,15 +909,12 @@
             <w:tcW w:type="dxa" w:w="3312"/>
           </w:tcPr>
           <w:p>
-            <w:pPr>
-              <w:spacing w:line="276" w:lineRule="auto" w:after="40"/>
-            </w:pPr>
             <w:r>
               <w:rPr>
                 <w:rFonts w:ascii="Times New Roman" w:hAnsi="Times New Roman"/>
                 <w:sz w:val="19"/>
               </w:rPr>
-              <w:t>useEffect(() =&gt; { ... }, []) với dependency array rỗng.</w:t>
+              <w:t>Đạt: Bọc SafeAreaView và padding chuẩn.</w:t>
             </w:r>
           </w:p>
         </w:tc>
@@ -517,16 +925,12 @@
             <w:tcW w:type="dxa" w:w="3312"/>
           </w:tcPr>
           <w:p>
-            <w:pPr>
-              <w:spacing w:line="276" w:lineRule="auto" w:after="40"/>
-            </w:pPr>
             <w:r>
               <w:rPr>
                 <w:rFonts w:ascii="Times New Roman" w:hAnsi="Times New Roman"/>
-                <w:b/>
                 <w:sz w:val="19"/>
               </w:rPr>
-              <w:t>Updating (Cập nhật)</w:t>
+              <w:t>Header cố định</w:t>
             </w:r>
           </w:p>
         </w:tc>
@@ -535,15 +939,12 @@
             <w:tcW w:type="dxa" w:w="3312"/>
           </w:tcPr>
           <w:p>
-            <w:pPr>
-              <w:spacing w:line="276" w:lineRule="auto" w:after="40"/>
-            </w:pPr>
             <w:r>
               <w:rPr>
                 <w:rFonts w:ascii="Times New Roman" w:hAnsi="Times New Roman"/>
                 <w:sz w:val="19"/>
               </w:rPr>
-              <w:t>Phương thức componentDidUpdate(prevProps, prevState).</w:t>
+              <w:t>Dùng position (absolute) nếu cần.</w:t>
             </w:r>
           </w:p>
         </w:tc>
@@ -552,15 +953,12 @@
             <w:tcW w:type="dxa" w:w="3312"/>
           </w:tcPr>
           <w:p>
-            <w:pPr>
-              <w:spacing w:line="276" w:lineRule="auto" w:after="40"/>
-            </w:pPr>
             <w:r>
               <w:rPr>
                 <w:rFonts w:ascii="Times New Roman" w:hAnsi="Times New Roman"/>
                 <w:sz w:val="19"/>
               </w:rPr>
-              <w:t>useEffect(() =&gt; { ... }, [dependencies]) khi biến theo dõi đổi.</w:t>
+              <w:t>Đạt: FixedHeader nổi cố định với zIndex: 100.</w:t>
             </w:r>
           </w:p>
         </w:tc>
@@ -571,16 +969,12 @@
             <w:tcW w:type="dxa" w:w="3312"/>
           </w:tcPr>
           <w:p>
-            <w:pPr>
-              <w:spacing w:line="276" w:lineRule="auto" w:after="40"/>
-            </w:pPr>
             <w:r>
               <w:rPr>
                 <w:rFonts w:ascii="Times New Roman" w:hAnsi="Times New Roman"/>
-                <w:b/>
                 <w:sz w:val="19"/>
               </w:rPr>
-              <w:t>Tối ưu hóa re-render</w:t>
+              <w:t>Tối ưu FlatList</w:t>
             </w:r>
           </w:p>
         </w:tc>
@@ -589,15 +983,12 @@
             <w:tcW w:type="dxa" w:w="3312"/>
           </w:tcPr>
           <w:p>
-            <w:pPr>
-              <w:spacing w:line="276" w:lineRule="auto" w:after="40"/>
-            </w:pPr>
             <w:r>
               <w:rPr>
                 <w:rFonts w:ascii="Times New Roman" w:hAnsi="Times New Roman"/>
                 <w:sz w:val="19"/>
               </w:rPr>
-              <w:t>shouldComponentUpdate() hoặc React.PureComponent.</w:t>
+              <w:t>keyExtractor + renderItem tách component.</w:t>
             </w:r>
           </w:p>
         </w:tc>
@@ -606,15 +997,12 @@
             <w:tcW w:type="dxa" w:w="3312"/>
           </w:tcPr>
           <w:p>
-            <w:pPr>
-              <w:spacing w:line="276" w:lineRule="auto" w:after="40"/>
-            </w:pPr>
             <w:r>
               <w:rPr>
                 <w:rFonts w:ascii="Times New Roman" w:hAnsi="Times New Roman"/>
                 <w:sz w:val="19"/>
               </w:rPr>
-              <w:t>React.memo, useMemo, useCallback.</w:t>
+              <w:t>Đạt: Không warning key, tách ProductCard.js độc lập.</w:t>
             </w:r>
           </w:p>
         </w:tc>
@@ -625,16 +1013,12 @@
             <w:tcW w:type="dxa" w:w="3312"/>
           </w:tcPr>
           <w:p>
-            <w:pPr>
-              <w:spacing w:line="276" w:lineRule="auto" w:after="40"/>
-            </w:pPr>
             <w:r>
               <w:rPr>
                 <w:rFonts w:ascii="Times New Roman" w:hAnsi="Times New Roman"/>
-                <w:b/>
                 <w:sz w:val="19"/>
               </w:rPr>
-              <w:t>Unmounting (Dọn dẹp)</w:t>
+              <w:t>Responsive</w:t>
             </w:r>
           </w:p>
         </w:tc>
@@ -643,15 +1027,12 @@
             <w:tcW w:type="dxa" w:w="3312"/>
           </w:tcPr>
           <w:p>
-            <w:pPr>
-              <w:spacing w:line="276" w:lineRule="auto" w:after="40"/>
-            </w:pPr>
             <w:r>
               <w:rPr>
                 <w:rFonts w:ascii="Times New Roman" w:hAnsi="Times New Roman"/>
                 <w:sz w:val="19"/>
               </w:rPr>
-              <w:t>Phương thức componentWillUnmount() gọi trước khi xóa khỏi DOM.</w:t>
+              <w:t>Kiểm tra trên ít nhất 2 kích thước màn hình.</w:t>
             </w:r>
           </w:p>
         </w:tc>
@@ -660,69 +1041,12 @@
             <w:tcW w:type="dxa" w:w="3312"/>
           </w:tcPr>
           <w:p>
-            <w:pPr>
-              <w:spacing w:line="276" w:lineRule="auto" w:after="40"/>
-            </w:pPr>
             <w:r>
               <w:rPr>
                 <w:rFonts w:ascii="Times New Roman" w:hAnsi="Times New Roman"/>
                 <w:sz w:val="19"/>
               </w:rPr>
-              <w:t>Cleanup function trả về từ useEffect: return () =&gt; { ... };</w:t>
-            </w:r>
-          </w:p>
-        </w:tc>
-      </w:tr>
-      <w:tr>
-        <w:tc>
-          <w:tcPr>
-            <w:tcW w:type="dxa" w:w="3312"/>
-          </w:tcPr>
-          <w:p>
-            <w:pPr>
-              <w:spacing w:line="276" w:lineRule="auto" w:after="40"/>
-            </w:pPr>
-            <w:r>
-              <w:rPr>
-                <w:rFonts w:ascii="Times New Roman" w:hAnsi="Times New Roman"/>
-                <w:b/>
-                <w:sz w:val="19"/>
-              </w:rPr>
-              <w:t>Khả năng tái sử dụng</w:t>
-            </w:r>
-          </w:p>
-        </w:tc>
-        <w:tc>
-          <w:tcPr>
-            <w:tcW w:type="dxa" w:w="3312"/>
-          </w:tcPr>
-          <w:p>
-            <w:pPr>
-              <w:spacing w:line="276" w:lineRule="auto" w:after="40"/>
-            </w:pPr>
-            <w:r>
-              <w:rPr>
-                <w:rFonts w:ascii="Times New Roman" w:hAnsi="Times New Roman"/>
-                <w:sz w:val="19"/>
-              </w:rPr>
-              <w:t>Khó chia sẻ logic, phải dùng HOC hoặc Render Props.</w:t>
-            </w:r>
-          </w:p>
-        </w:tc>
-        <w:tc>
-          <w:tcPr>
-            <w:tcW w:type="dxa" w:w="3312"/>
-          </w:tcPr>
-          <w:p>
-            <w:pPr>
-              <w:spacing w:line="276" w:lineRule="auto" w:after="40"/>
-            </w:pPr>
-            <w:r>
-              <w:rPr>
-                <w:rFonts w:ascii="Times New Roman" w:hAnsi="Times New Roman"/>
-                <w:sz w:val="19"/>
-              </w:rPr>
-              <w:t>Rất dễ dàng nhờ trích xuất thành Custom Hooks độc lập.</w:t>
+              <w:t>Đạt: Tự động đổi 1 cột (dọc) và 2 cột (ngang), có nút test.</w:t>
             </w:r>
           </w:p>
         </w:tc>
@@ -730,1053 +1054,12 @@
     </w:tbl>
     <w:p>
       <w:pPr>
-        <w:spacing w:after="80"/>
+        <w:spacing w:after="160"/>
       </w:pPr>
     </w:p>
     <w:p>
       <w:pPr>
-        <w:spacing w:before="200" w:after="60"/>
-      </w:pPr>
-      <w:r>
-        <w:rPr>
-          <w:rFonts w:ascii="Times New Roman" w:hAnsi="Times New Roman"/>
-          <w:b/>
-          <w:color w:val="0F172A"/>
-          <w:sz w:val="24"/>
-        </w:rPr>
-        <w:t>Câu 3. Controlled Component trong React Native và Cơ chế Hoạt động</w:t>
-      </w:r>
-    </w:p>
-    <w:p>
-      <w:pPr>
-        <w:spacing w:after="80" w:line="276" w:lineRule="auto"/>
-      </w:pPr>
-      <w:r>
-        <w:rPr>
-          <w:rFonts w:ascii="Times New Roman" w:hAnsi="Times New Roman"/>
-          <w:i w:val="0"/>
-          <w:color w:val="334155"/>
-          <w:sz w:val="22"/>
-        </w:rPr>
-        <w:t>Trong React Native, Controlled Component là một component mà dữ liệu của nó (thường là giá trị của các input như TextInput) được kiểm soát và quản lý trực tiếp bởi state của React.</w:t>
-      </w:r>
-    </w:p>
-    <w:p>
-      <w:pPr>
-        <w:pStyle w:val="ListBullet"/>
-        <w:spacing w:after="60" w:line="276" w:lineRule="auto"/>
-      </w:pPr>
-      <w:r>
-        <w:rPr>
-          <w:rFonts w:ascii="Times New Roman" w:hAnsi="Times New Roman"/>
-          <w:b/>
-          <w:color w:val="0F172A"/>
-          <w:sz w:val="22"/>
-        </w:rPr>
-        <w:t xml:space="preserve">Đồng bộ chiều xuôi (State → Input): </w:t>
-      </w:r>
-      <w:r>
-        <w:rPr>
-          <w:rFonts w:ascii="Times New Roman" w:hAnsi="Times New Roman"/>
-          <w:color w:val="334155"/>
-          <w:sz w:val="22"/>
-        </w:rPr>
-        <w:t>Thuộc tính value của TextInput được gán bằng giá trị state (value={text}).</w:t>
-      </w:r>
-    </w:p>
-    <w:p>
-      <w:pPr>
-        <w:pStyle w:val="ListBullet"/>
-        <w:spacing w:after="60" w:line="276" w:lineRule="auto"/>
-      </w:pPr>
-      <w:r>
-        <w:rPr>
-          <w:rFonts w:ascii="Times New Roman" w:hAnsi="Times New Roman"/>
-          <w:b/>
-          <w:color w:val="0F172A"/>
-          <w:sz w:val="22"/>
-        </w:rPr>
-        <w:t xml:space="preserve">Đồng bộ chiều ngược (Input → State): </w:t>
-      </w:r>
-      <w:r>
-        <w:rPr>
-          <w:rFonts w:ascii="Times New Roman" w:hAnsi="Times New Roman"/>
-          <w:color w:val="334155"/>
-          <w:sz w:val="22"/>
-        </w:rPr>
-        <w:t>Sự kiện onChangeText nhận hàm xử lý (handleChangeText) được gọi mỗi khi văn bản thay đổi để cập nhật state. Khi state đổi, component render lại và TextInput hiển thị giá trị mới.</w:t>
-      </w:r>
-    </w:p>
-    <w:p>
-      <w:pPr>
-        <w:pStyle w:val="ListBullet"/>
-        <w:spacing w:after="60" w:line="276" w:lineRule="auto"/>
-      </w:pPr>
-      <w:r>
-        <w:rPr>
-          <w:rFonts w:ascii="Times New Roman" w:hAnsi="Times New Roman"/>
-          <w:b/>
-          <w:color w:val="0F172A"/>
-          <w:sz w:val="22"/>
-        </w:rPr>
-        <w:t xml:space="preserve">Đặc điểm &amp; Lợi ích: </w:t>
-      </w:r>
-      <w:r>
-        <w:rPr>
-          <w:rFonts w:ascii="Times New Roman" w:hAnsi="Times New Roman"/>
-          <w:color w:val="334155"/>
-          <w:sz w:val="22"/>
-        </w:rPr>
-        <w:t>Dữ liệu input luôn đồng bộ thời gian thực; Mọi thay đổi đều được kiểm soát bởi React; Dễ dàng thực hiện các nghiệp vụ như validate độ dài, kiểm tra định dạng email, mã hóa mật khẩu, hoặc bật/tắt nút gửi.</w:t>
-      </w:r>
-    </w:p>
-    <w:p>
-      <w:pPr>
-        <w:spacing w:before="200" w:after="60"/>
-      </w:pPr>
-      <w:r>
-        <w:rPr>
-          <w:rFonts w:ascii="Times New Roman" w:hAnsi="Times New Roman"/>
-          <w:b/>
-          <w:color w:val="0F172A"/>
-          <w:sz w:val="24"/>
-        </w:rPr>
-        <w:t>Câu 4. Phân biệt Controlled Component và Uncontrolled Component</w:t>
-      </w:r>
-    </w:p>
-    <w:p>
-      <w:pPr>
-        <w:pStyle w:val="ListBullet"/>
-        <w:spacing w:after="60" w:line="276" w:lineRule="auto"/>
-      </w:pPr>
-      <w:r>
-        <w:rPr>
-          <w:rFonts w:ascii="Times New Roman" w:hAnsi="Times New Roman"/>
-          <w:b/>
-          <w:color w:val="0F172A"/>
-          <w:sz w:val="22"/>
-        </w:rPr>
-        <w:t xml:space="preserve">Controlled Component: </w:t>
-      </w:r>
-      <w:r>
-        <w:rPr>
-          <w:rFonts w:ascii="Times New Roman" w:hAnsi="Times New Roman"/>
-          <w:color w:val="334155"/>
-          <w:sz w:val="22"/>
-        </w:rPr>
-        <w:t>Dữ liệu do React State kiểm soát; có thể can thiệp, validate và biến đổi dữ liệu tại từng thao tác gõ; phù hợp với các form đăng ký, tìm kiếm, nhập liệu cần kiểm tra tính hợp lệ chặt chẽ.</w:t>
-      </w:r>
-    </w:p>
-    <w:p>
-      <w:pPr>
-        <w:pStyle w:val="ListBullet"/>
-        <w:spacing w:after="60" w:line="276" w:lineRule="auto"/>
-      </w:pPr>
-      <w:r>
-        <w:rPr>
-          <w:rFonts w:ascii="Times New Roman" w:hAnsi="Times New Roman"/>
-          <w:b/>
-          <w:color w:val="0F172A"/>
-          <w:sz w:val="22"/>
-        </w:rPr>
-        <w:t xml:space="preserve">Uncontrolled Component: </w:t>
-      </w:r>
-      <w:r>
-        <w:rPr>
-          <w:rFonts w:ascii="Times New Roman" w:hAnsi="Times New Roman"/>
-          <w:color w:val="334155"/>
-          <w:sz w:val="22"/>
-        </w:rPr>
-        <w:t>Dữ liệu do chính phần tử DOM/Native nội bộ lưu giữ; React không quản lý giá trị từng thời điểm mà chỉ truy xuất giá trị khi cần (thường thông qua useRef); ưu điểm là ít lần re-render hơn đối với form lớn nhưng khó can thiệp validation thời gian thực.</w:t>
-      </w:r>
-    </w:p>
-    <w:p>
-      <w:pPr>
-        <w:spacing w:before="200" w:after="60"/>
-      </w:pPr>
-      <w:r>
-        <w:rPr>
-          <w:rFonts w:ascii="Times New Roman" w:hAnsi="Times New Roman"/>
-          <w:b/>
-          <w:color w:val="0F172A"/>
-          <w:sz w:val="24"/>
-        </w:rPr>
-        <w:t>Câu 5. Kỹ thuật Lồng Component (Nested Component) và Luồng Dữ liệu (Data Flow)</w:t>
-      </w:r>
-    </w:p>
-    <w:p>
-      <w:pPr>
-        <w:spacing w:after="80" w:line="276" w:lineRule="auto"/>
-      </w:pPr>
-      <w:r>
-        <w:rPr>
-          <w:rFonts w:ascii="Times New Roman" w:hAnsi="Times New Roman"/>
-          <w:i w:val="0"/>
-          <w:color w:val="334155"/>
-          <w:sz w:val="22"/>
-        </w:rPr>
-        <w:t>Một trong những sức mạnh của React Native là khả năng tạo ra các giao diện phức tạp bằng cách lồng các component lại với nhau. Một component có thể chứa một hoặc nhiều component khác bên trong phần JSX của nó.</w:t>
-      </w:r>
-    </w:p>
-    <w:p>
-      <w:pPr>
-        <w:pStyle w:val="ListBullet"/>
-        <w:spacing w:after="60" w:line="276" w:lineRule="auto"/>
-      </w:pPr>
-      <w:r>
-        <w:rPr>
-          <w:rFonts w:ascii="Times New Roman" w:hAnsi="Times New Roman"/>
-          <w:b/>
-          <w:color w:val="0F172A"/>
-          <w:sz w:val="22"/>
-        </w:rPr>
-        <w:t xml:space="preserve">Nguyên tắc truyền dữ liệu qua Props: </w:t>
-      </w:r>
-      <w:r>
-        <w:rPr>
-          <w:rFonts w:ascii="Times New Roman" w:hAnsi="Times New Roman"/>
-          <w:color w:val="334155"/>
-          <w:sz w:val="22"/>
-        </w:rPr>
-        <w:t>Component cha truyền dữ liệu hoặc hàm callback xuống component con thông qua props.</w:t>
-      </w:r>
-    </w:p>
-    <w:p>
-      <w:pPr>
-        <w:pStyle w:val="ListBullet"/>
-        <w:spacing w:after="60" w:line="276" w:lineRule="auto"/>
-      </w:pPr>
-      <w:r>
-        <w:rPr>
-          <w:rFonts w:ascii="Times New Roman" w:hAnsi="Times New Roman"/>
-          <w:b/>
-          <w:color w:val="0F172A"/>
-          <w:sz w:val="22"/>
-        </w:rPr>
-        <w:t xml:space="preserve">Tính bất biến của Props: </w:t>
-      </w:r>
-      <w:r>
-        <w:rPr>
-          <w:rFonts w:ascii="Times New Roman" w:hAnsi="Times New Roman"/>
-          <w:color w:val="334155"/>
-          <w:sz w:val="22"/>
-        </w:rPr>
-        <w:t>Props là bất biến (Read-only) đối với component con, con không được sửa trực tiếp props mà chỉ sử dụng để hiển thị hoặc xử lý sự kiện.</w:t>
-      </w:r>
-    </w:p>
-    <w:p>
-      <w:pPr>
-        <w:pStyle w:val="ListBullet"/>
-        <w:spacing w:after="60" w:line="276" w:lineRule="auto"/>
-      </w:pPr>
-      <w:r>
-        <w:rPr>
-          <w:rFonts w:ascii="Times New Roman" w:hAnsi="Times New Roman"/>
-          <w:b/>
-          <w:color w:val="0F172A"/>
-          <w:sz w:val="22"/>
-        </w:rPr>
-        <w:t xml:space="preserve">Ví dụ thực tiễn: </w:t>
-      </w:r>
-      <w:r>
-        <w:rPr>
-          <w:rFonts w:ascii="Times New Roman" w:hAnsi="Times New Roman"/>
-          <w:color w:val="334155"/>
-          <w:sz w:val="22"/>
-        </w:rPr>
-        <w:t>Ví dụ minh họa: Component UserProfile chứa Avatar bên trong. UserProfile nhận profileImage, name, bio và truyền profileImage xuống Avatar để hiển thị ảnh đại diện bo góc.</w:t>
-      </w:r>
-    </w:p>
-    <w:p>
-      <w:pPr>
-        <w:spacing w:before="280" w:after="80"/>
-      </w:pPr>
-      <w:r>
-        <w:rPr>
-          <w:rFonts w:ascii="Times New Roman" w:hAnsi="Times New Roman"/>
-          <w:b/>
-          <w:color w:val="1E3A8A"/>
-          <w:sz w:val="27"/>
-        </w:rPr>
-        <w:t>PHẦN B. BÀI TẬP LUYỆN TẬP THỰC HÀNH</w:t>
-      </w:r>
-    </w:p>
-    <w:p>
-      <w:pPr>
-        <w:spacing w:before="200" w:after="60"/>
-      </w:pPr>
-      <w:r>
-        <w:rPr>
-          <w:rFonts w:ascii="Times New Roman" w:hAnsi="Times New Roman"/>
-          <w:b/>
-          <w:color w:val="0F172A"/>
-          <w:sz w:val="24"/>
-        </w:rPr>
-        <w:t>1. Cấu trúc thư mục thực hành Tuần 7</w:t>
-      </w:r>
-    </w:p>
-    <w:p>
-      <w:pPr>
-        <w:spacing w:before="80" w:after="120"/>
-        <w:ind w:left="288"/>
-        <w:shd w:fill="F1F5F9"/>
-      </w:pPr>
-      <w:r>
-        <w:rPr>
-          <w:rFonts w:ascii="Consolas" w:hAnsi="Consolas"/>
-          <w:color w:val="1E293B"/>
-          <w:sz w:val="19"/>
-        </w:rPr>
-        <w:t>Luyện Tập 7/</w:t>
-        <w:br/>
-        <w:t>├── components/</w:t>
-        <w:br/>
-        <w:t>│   ├── LifecycleDemo.js   # Bài 1: Minh họa Vòng đời (Mounting, Updating, Unmounting)</w:t>
-        <w:br/>
-        <w:t>│   ├── ControlledInput.js # Bài 2: Controlled Component với TextInput, validation &amp; preview</w:t>
-        <w:br/>
-        <w:t>│   ├── Avatar.js          # Bài 3a: Component con hiển thị ảnh đại diện bo tròn</w:t>
-        <w:br/>
-        <w:t>│   └── UserProfile.js     # Bài 3b: Component lồng Avatar và thông tin hồ sơ</w:t>
-        <w:br/>
-        <w:t>├── App.js                 # Màn hình chính tổng hợp 3 chuyên đề với giao diện chuẩn UI/UX</w:t>
-        <w:br/>
-        <w:t>└── BuiDuyThanh_LuyenTap7.docx # Báo cáo chi tiết lý thuyết và thực hành</w:t>
-        <w:br/>
-      </w:r>
-    </w:p>
-    <w:p>
-      <w:pPr>
-        <w:spacing w:before="200" w:after="60"/>
-      </w:pPr>
-      <w:r>
-        <w:rPr>
-          <w:rFonts w:ascii="Times New Roman" w:hAnsi="Times New Roman"/>
-          <w:b/>
-          <w:color w:val="0F172A"/>
-          <w:sz w:val="24"/>
-        </w:rPr>
-        <w:t>2. Chi tiết cài đặt các Component</w:t>
-      </w:r>
-    </w:p>
-    <w:p>
-      <w:pPr>
-        <w:spacing w:after="80" w:line="276" w:lineRule="auto"/>
-      </w:pPr>
-      <w:r>
-        <w:rPr>
-          <w:rFonts w:ascii="Times New Roman" w:hAnsi="Times New Roman"/>
-          <w:i w:val="0"/>
-          <w:color w:val="334155"/>
-          <w:sz w:val="22"/>
-        </w:rPr>
-        <w:t>Bài tập 1: Component LifecycleDemo (Quản lý Vòng đời Component)</w:t>
-      </w:r>
-    </w:p>
-    <w:p>
-      <w:pPr>
-        <w:spacing w:after="80" w:line="276" w:lineRule="auto"/>
-      </w:pPr>
-      <w:r>
-        <w:rPr>
-          <w:rFonts w:ascii="Times New Roman" w:hAnsi="Times New Roman"/>
-          <w:i w:val="0"/>
-          <w:color w:val="334155"/>
-          <w:sz w:val="22"/>
-        </w:rPr>
-        <w:t>Component cài đặt đầy đủ cả 3 giai đoạn: Khi mount thiết lập timer đếm thời gian sống (uptime) và ghi log; khi người dùng bấm nút thì state updateCount thay đổi kích hoạt Updating; và cleanup function trong useEffect dọn dẹp timer khi component bị unmount.</w:t>
-      </w:r>
-    </w:p>
-    <w:p>
-      <w:pPr>
-        <w:spacing w:before="80" w:after="120"/>
-        <w:ind w:left="288"/>
-        <w:shd w:fill="F1F5F9"/>
-      </w:pPr>
-      <w:r>
-        <w:rPr>
-          <w:rFonts w:ascii="Consolas" w:hAnsi="Consolas"/>
-          <w:color w:val="1E293B"/>
-          <w:sz w:val="19"/>
-        </w:rPr>
-        <w:t>// Luyện Tập 7/components/LifecycleDemo.js (Trích đoạn cốt lõi)</w:t>
-        <w:br/>
-        <w:t>useEffect(() =&gt; {</w:t>
-        <w:br/>
-        <w:t xml:space="preserve">  setMountedTime(new Date().toLocaleTimeString());</w:t>
-        <w:br/>
-        <w:t xml:space="preserve">  addLog('🟢 [MOUNTING] Component được tạo và gắn vào giao diện');</w:t>
-        <w:br/>
-        <w:br/>
-        <w:t xml:space="preserve">  // Thiết lập timer đếm thời gian tồn tại</w:t>
-        <w:br/>
-        <w:t xml:space="preserve">  const timer = setInterval(() =&gt; {</w:t>
-        <w:br/>
-        <w:t xml:space="preserve">    setUptimeSeconds(prev =&gt; prev + 1);</w:t>
-        <w:br/>
-        <w:t xml:space="preserve">  }, 1000);</w:t>
-        <w:br/>
-        <w:br/>
-        <w:t xml:space="preserve">  // GIAI ĐOẠN UNMOUNTING: Cleanup function dọn dẹp interval</w:t>
-        <w:br/>
-        <w:t xml:space="preserve">  return () =&gt; {</w:t>
-        <w:br/>
-        <w:t xml:space="preserve">    clearInterval(timer);</w:t>
-        <w:br/>
-        <w:t xml:space="preserve">    console.log('🔴 [UNMOUNTING] Cleanup: Timer đã được hủy khi component bị unmount');</w:t>
-        <w:br/>
-        <w:t xml:space="preserve">  };</w:t>
-        <w:br/>
-        <w:t>}, []);</w:t>
-        <w:br/>
-        <w:br/>
-        <w:t>// GIAI ĐOẠN UPDATING: Theo dõi state updateCount</w:t>
-        <w:br/>
-        <w:t>useEffect(() =&gt; {</w:t>
-        <w:br/>
-        <w:t xml:space="preserve">  if (updateCount &gt; 0) {</w:t>
-        <w:br/>
-        <w:t xml:space="preserve">    addLog(`🔄 [UPDATING] State updateCount thay đổi thành: ${updateCount}`);</w:t>
-        <w:br/>
-        <w:t xml:space="preserve">  }</w:t>
-        <w:br/>
-        <w:t>}, [updateCount]);</w:t>
-        <w:br/>
-      </w:r>
-    </w:p>
-    <w:p>
-      <w:pPr>
-        <w:spacing w:after="80" w:line="276" w:lineRule="auto"/>
-      </w:pPr>
-      <w:r>
-        <w:rPr>
-          <w:rFonts w:ascii="Times New Roman" w:hAnsi="Times New Roman"/>
-          <w:i w:val="0"/>
-          <w:color w:val="334155"/>
-          <w:sz w:val="22"/>
-        </w:rPr>
-        <w:t>Bài tập 2: Component ControlledInput (Controlled TextInput)</w:t>
-      </w:r>
-    </w:p>
-    <w:p>
-      <w:pPr>
-        <w:spacing w:after="80" w:line="276" w:lineRule="auto"/>
-      </w:pPr>
-      <w:r>
-        <w:rPr>
-          <w:rFonts w:ascii="Times New Roman" w:hAnsi="Times New Roman"/>
-          <w:i w:val="0"/>
-          <w:color w:val="334155"/>
-          <w:sz w:val="22"/>
-        </w:rPr>
-        <w:t>Quản lý ô nhập văn bản có kiểm soát, liên kết 2 chiều với state, tích hợp logic kiểm tra độ dài hợp lệ, đếm số ký tự, nút xóa nội dung tức thì và hiển thị preview thời gian thực.</w:t>
-      </w:r>
-    </w:p>
-    <w:p>
-      <w:pPr>
-        <w:spacing w:before="80" w:after="120"/>
-        <w:ind w:left="288"/>
-        <w:shd w:fill="F1F5F9"/>
-      </w:pPr>
-      <w:r>
-        <w:rPr>
-          <w:rFonts w:ascii="Consolas" w:hAnsi="Consolas"/>
-          <w:color w:val="1E293B"/>
-          <w:sz w:val="19"/>
-        </w:rPr>
-        <w:t>// Luyện Tập 7/components/ControlledInput.js (Trích đoạn cốt lõi)</w:t>
-        <w:br/>
-        <w:t>const [text, setText] = useState('');</w:t>
-        <w:br/>
-        <w:br/>
-        <w:t>&lt;TextInput</w:t>
-        <w:br/>
-        <w:t xml:space="preserve">  style={[styles.input, isTooLong &amp;&amp; styles.inputError]}</w:t>
-        <w:br/>
-        <w:t xml:space="preserve">  value={text}</w:t>
-        <w:br/>
-        <w:t xml:space="preserve">  onChangeText={(newText) =&gt; setText(newText)}</w:t>
-        <w:br/>
-        <w:t xml:space="preserve">  placeholder="Nhập ghi chú hoặc nội dung bất kỳ..."</w:t>
-        <w:br/>
-        <w:t>/&gt;</w:t>
-        <w:br/>
-        <w:t>&lt;Text&gt;Kết quả đồng bộ: {text}&lt;/Text&gt;</w:t>
-        <w:br/>
-      </w:r>
-    </w:p>
-    <w:p>
-      <w:pPr>
-        <w:spacing w:after="80" w:line="276" w:lineRule="auto"/>
-      </w:pPr>
-      <w:r>
-        <w:rPr>
-          <w:rFonts w:ascii="Times New Roman" w:hAnsi="Times New Roman"/>
-          <w:i w:val="0"/>
-          <w:color w:val="334155"/>
-          <w:sz w:val="22"/>
-        </w:rPr>
-        <w:t>Bài tập 3: Component Avatar và UserProfile (Kỹ thuật Lồng Component)</w:t>
-      </w:r>
-    </w:p>
-    <w:p>
-      <w:pPr>
-        <w:spacing w:after="80" w:line="276" w:lineRule="auto"/>
-      </w:pPr>
-      <w:r>
-        <w:rPr>
-          <w:rFonts w:ascii="Times New Roman" w:hAnsi="Times New Roman"/>
-          <w:i w:val="0"/>
-          <w:color w:val="334155"/>
-          <w:sz w:val="22"/>
-        </w:rPr>
-        <w:t>Component con Avatar nhận imageUrl và render ảnh đại diện tròn có viền và chấm trạng thái online; Component cha UserProfile nhúng Avatar bên trong và hiển thị thông tin hồ sơ cá nhân đầy đủ.</w:t>
-      </w:r>
-    </w:p>
-    <w:p>
-      <w:pPr>
-        <w:spacing w:before="80" w:after="120"/>
-        <w:ind w:left="288"/>
-        <w:shd w:fill="F1F5F9"/>
-      </w:pPr>
-      <w:r>
-        <w:rPr>
-          <w:rFonts w:ascii="Consolas" w:hAnsi="Consolas"/>
-          <w:color w:val="1E293B"/>
-          <w:sz w:val="19"/>
-        </w:rPr>
-        <w:t>// Luyện Tập 7/components/UserProfile.js (Trích đoạn cốt lõi)</w:t>
-        <w:br/>
-        <w:t>import Avatar from './Avatar';</w:t>
-        <w:br/>
-        <w:br/>
-        <w:t>const UserProfile = ({ name, role, bio, profileImage, studentId, email }) =&gt; {</w:t>
-        <w:br/>
-        <w:t xml:space="preserve">  return (</w:t>
-        <w:br/>
-        <w:t xml:space="preserve">    &lt;View style={styles.card}&gt;</w:t>
-        <w:br/>
-        <w:t xml:space="preserve">      &lt;View style={styles.profileHeader}&gt;</w:t>
-        <w:br/>
-        <w:t xml:space="preserve">        {/* LỒNG COMPONENT: Nhúng Avatar bên trong UserProfile */}</w:t>
-        <w:br/>
-        <w:t xml:space="preserve">        &lt;Avatar imageUrl={profileImage} name={name} size={58} /&gt;</w:t>
-        <w:br/>
-        <w:t xml:space="preserve">        &lt;View style={styles.headerInfo}&gt;</w:t>
-        <w:br/>
-        <w:t xml:space="preserve">          &lt;Text style={styles.nameText}&gt;{name}&lt;/Text&gt;</w:t>
-        <w:br/>
-        <w:t xml:space="preserve">          &lt;Text style={styles.roleText}&gt;{role}&lt;/Text&gt;</w:t>
-        <w:br/>
-        <w:t xml:space="preserve">        &lt;/View&gt;</w:t>
-        <w:br/>
-        <w:t xml:space="preserve">      &lt;/View&gt;</w:t>
-        <w:br/>
-        <w:t xml:space="preserve">      &lt;Text style={styles.bioText}&gt;{bio}&lt;/Text&gt;</w:t>
-        <w:br/>
-        <w:t xml:space="preserve">    &lt;/View&gt;</w:t>
-        <w:br/>
-        <w:t xml:space="preserve">  );</w:t>
-        <w:br/>
-        <w:t>};</w:t>
-        <w:br/>
-      </w:r>
-    </w:p>
-    <w:p>
-      <w:pPr>
-        <w:spacing w:before="200" w:after="60"/>
-      </w:pPr>
-      <w:r>
-        <w:rPr>
-          <w:rFonts w:ascii="Times New Roman" w:hAnsi="Times New Roman"/>
-          <w:b/>
-          <w:color w:val="0F172A"/>
-          <w:sz w:val="24"/>
-        </w:rPr>
-        <w:t>3. Bảng đối chiếu yêu cầu của đề bài</w:t>
-      </w:r>
-    </w:p>
-    <w:tbl>
-      <w:tblPr>
-        <w:tblW w:type="auto" w:w="0"/>
-        <w:jc w:val="center"/>
-        <w:tblLook w:firstColumn="1" w:firstRow="1" w:lastColumn="0" w:lastRow="0" w:noHBand="0" w:noVBand="1" w:val="04A0"/>
-      </w:tblPr>
-      <w:tblGrid>
-        <w:gridCol w:w="3312"/>
-        <w:gridCol w:w="3312"/>
-        <w:gridCol w:w="3312"/>
-      </w:tblGrid>
-      <w:tr>
-        <w:tc>
-          <w:tcPr>
-            <w:tcW w:type="dxa" w:w="3312"/>
-            <w:shd w:fill="E2E8F0"/>
-          </w:tcPr>
-          <w:p>
-            <w:pPr>
-              <w:spacing w:line="276" w:lineRule="auto" w:after="40"/>
-            </w:pPr>
-            <w:r>
-              <w:rPr>
-                <w:rFonts w:ascii="Times New Roman" w:hAnsi="Times New Roman"/>
-                <w:b/>
-                <w:color w:val="1E3A8A"/>
-                <w:sz w:val="19"/>
-              </w:rPr>
-              <w:t>Nội dung đề tài</w:t>
-            </w:r>
-          </w:p>
-        </w:tc>
-        <w:tc>
-          <w:tcPr>
-            <w:tcW w:type="dxa" w:w="3312"/>
-            <w:shd w:fill="E2E8F0"/>
-          </w:tcPr>
-          <w:p>
-            <w:pPr>
-              <w:spacing w:line="276" w:lineRule="auto" w:after="40"/>
-            </w:pPr>
-            <w:r>
-              <w:rPr>
-                <w:rFonts w:ascii="Times New Roman" w:hAnsi="Times New Roman"/>
-                <w:b/>
-                <w:color w:val="1E3A8A"/>
-                <w:sz w:val="19"/>
-              </w:rPr>
-              <w:t>Yêu cầu trọng tâm</w:t>
-            </w:r>
-          </w:p>
-        </w:tc>
-        <w:tc>
-          <w:tcPr>
-            <w:tcW w:type="dxa" w:w="3312"/>
-            <w:shd w:fill="E2E8F0"/>
-          </w:tcPr>
-          <w:p>
-            <w:pPr>
-              <w:spacing w:line="276" w:lineRule="auto" w:after="40"/>
-            </w:pPr>
-            <w:r>
-              <w:rPr>
-                <w:rFonts w:ascii="Times New Roman" w:hAnsi="Times New Roman"/>
-                <w:b/>
-                <w:color w:val="1E3A8A"/>
-                <w:sz w:val="19"/>
-              </w:rPr>
-              <w:t>Tình trạng đáp ứng</w:t>
-            </w:r>
-          </w:p>
-        </w:tc>
-      </w:tr>
-      <w:tr>
-        <w:tc>
-          <w:tcPr>
-            <w:tcW w:type="dxa" w:w="3312"/>
-          </w:tcPr>
-          <w:p>
-            <w:pPr>
-              <w:spacing w:line="276" w:lineRule="auto" w:after="40"/>
-            </w:pPr>
-            <w:r>
-              <w:rPr>
-                <w:rFonts w:ascii="Times New Roman" w:hAnsi="Times New Roman"/>
-                <w:b/>
-                <w:sz w:val="19"/>
-              </w:rPr>
-              <w:t>Mục 3.4 Vòng đời</w:t>
-            </w:r>
-          </w:p>
-        </w:tc>
-        <w:tc>
-          <w:tcPr>
-            <w:tcW w:type="dxa" w:w="3312"/>
-          </w:tcPr>
-          <w:p>
-            <w:pPr>
-              <w:spacing w:line="276" w:lineRule="auto" w:after="40"/>
-            </w:pPr>
-            <w:r>
-              <w:rPr>
-                <w:rFonts w:ascii="Times New Roman" w:hAnsi="Times New Roman"/>
-                <w:sz w:val="19"/>
-              </w:rPr>
-              <w:t>Minh họa đầy đủ Mounting, Updating, Unmounting và cleanup function.</w:t>
-            </w:r>
-          </w:p>
-        </w:tc>
-        <w:tc>
-          <w:tcPr>
-            <w:tcW w:type="dxa" w:w="3312"/>
-          </w:tcPr>
-          <w:p>
-            <w:pPr>
-              <w:spacing w:line="276" w:lineRule="auto" w:after="40"/>
-            </w:pPr>
-            <w:r>
-              <w:rPr>
-                <w:rFonts w:ascii="Times New Roman" w:hAnsi="Times New Roman"/>
-                <w:sz w:val="19"/>
-              </w:rPr>
-              <w:t>Đã hoàn thành xuất sắc (LifecycleDemo)</w:t>
-            </w:r>
-          </w:p>
-        </w:tc>
-      </w:tr>
-      <w:tr>
-        <w:tc>
-          <w:tcPr>
-            <w:tcW w:type="dxa" w:w="3312"/>
-          </w:tcPr>
-          <w:p>
-            <w:pPr>
-              <w:spacing w:line="276" w:lineRule="auto" w:after="40"/>
-            </w:pPr>
-            <w:r>
-              <w:rPr>
-                <w:rFonts w:ascii="Times New Roman" w:hAnsi="Times New Roman"/>
-                <w:b/>
-                <w:sz w:val="19"/>
-              </w:rPr>
-              <w:t>Mục 3.5 Controlled Component</w:t>
-            </w:r>
-          </w:p>
-        </w:tc>
-        <w:tc>
-          <w:tcPr>
-            <w:tcW w:type="dxa" w:w="3312"/>
-          </w:tcPr>
-          <w:p>
-            <w:pPr>
-              <w:spacing w:line="276" w:lineRule="auto" w:after="40"/>
-            </w:pPr>
-            <w:r>
-              <w:rPr>
-                <w:rFonts w:ascii="Times New Roman" w:hAnsi="Times New Roman"/>
-                <w:sz w:val="19"/>
-              </w:rPr>
-              <w:t>Quản lý TextInput bằng state, đồng bộ dữ liệu, xử lý sự kiện.</w:t>
-            </w:r>
-          </w:p>
-        </w:tc>
-        <w:tc>
-          <w:tcPr>
-            <w:tcW w:type="dxa" w:w="3312"/>
-          </w:tcPr>
-          <w:p>
-            <w:pPr>
-              <w:spacing w:line="276" w:lineRule="auto" w:after="40"/>
-            </w:pPr>
-            <w:r>
-              <w:rPr>
-                <w:rFonts w:ascii="Times New Roman" w:hAnsi="Times New Roman"/>
-                <w:sz w:val="19"/>
-              </w:rPr>
-              <w:t>Đã hoàn thành xuất sắc (ControlledInput)</w:t>
-            </w:r>
-          </w:p>
-        </w:tc>
-      </w:tr>
-      <w:tr>
-        <w:tc>
-          <w:tcPr>
-            <w:tcW w:type="dxa" w:w="3312"/>
-          </w:tcPr>
-          <w:p>
-            <w:pPr>
-              <w:spacing w:line="276" w:lineRule="auto" w:after="40"/>
-            </w:pPr>
-            <w:r>
-              <w:rPr>
-                <w:rFonts w:ascii="Times New Roman" w:hAnsi="Times New Roman"/>
-                <w:b/>
-                <w:sz w:val="19"/>
-              </w:rPr>
-              <w:t>Mục 3.6 Lồng Component</w:t>
-            </w:r>
-          </w:p>
-        </w:tc>
-        <w:tc>
-          <w:tcPr>
-            <w:tcW w:type="dxa" w:w="3312"/>
-          </w:tcPr>
-          <w:p>
-            <w:pPr>
-              <w:spacing w:line="276" w:lineRule="auto" w:after="40"/>
-            </w:pPr>
-            <w:r>
-              <w:rPr>
-                <w:rFonts w:ascii="Times New Roman" w:hAnsi="Times New Roman"/>
-                <w:sz w:val="19"/>
-              </w:rPr>
-              <w:t>Tách component Avatar và nhúng vào UserProfile qua props.</w:t>
-            </w:r>
-          </w:p>
-        </w:tc>
-        <w:tc>
-          <w:tcPr>
-            <w:tcW w:type="dxa" w:w="3312"/>
-          </w:tcPr>
-          <w:p>
-            <w:pPr>
-              <w:spacing w:line="276" w:lineRule="auto" w:after="40"/>
-            </w:pPr>
-            <w:r>
-              <w:rPr>
-                <w:rFonts w:ascii="Times New Roman" w:hAnsi="Times New Roman"/>
-                <w:sz w:val="19"/>
-              </w:rPr>
-              <w:t>Đã hoàn thành xuất sắc (Avatar + UserProfile)</w:t>
-            </w:r>
-          </w:p>
-        </w:tc>
-      </w:tr>
-      <w:tr>
-        <w:tc>
-          <w:tcPr>
-            <w:tcW w:type="dxa" w:w="3312"/>
-          </w:tcPr>
-          <w:p>
-            <w:pPr>
-              <w:spacing w:line="276" w:lineRule="auto" w:after="40"/>
-            </w:pPr>
-            <w:r>
-              <w:rPr>
-                <w:rFonts w:ascii="Times New Roman" w:hAnsi="Times New Roman"/>
-                <w:b/>
-                <w:sz w:val="19"/>
-              </w:rPr>
-              <w:t>Màn hình tổng hợp</w:t>
-            </w:r>
-          </w:p>
-        </w:tc>
-        <w:tc>
-          <w:tcPr>
-            <w:tcW w:type="dxa" w:w="3312"/>
-          </w:tcPr>
-          <w:p>
-            <w:pPr>
-              <w:spacing w:line="276" w:lineRule="auto" w:after="40"/>
-            </w:pPr>
-            <w:r>
-              <w:rPr>
-                <w:rFonts w:ascii="Times New Roman" w:hAnsi="Times New Roman"/>
-                <w:sz w:val="19"/>
-              </w:rPr>
-              <w:t>Giao diện hoàn chỉnh, trực quan, hỗ trợ Toggle để test unmount.</w:t>
-            </w:r>
-          </w:p>
-        </w:tc>
-        <w:tc>
-          <w:tcPr>
-            <w:tcW w:type="dxa" w:w="3312"/>
-          </w:tcPr>
-          <w:p>
-            <w:pPr>
-              <w:spacing w:line="276" w:lineRule="auto" w:after="40"/>
-            </w:pPr>
-            <w:r>
-              <w:rPr>
-                <w:rFonts w:ascii="Times New Roman" w:hAnsi="Times New Roman"/>
-                <w:sz w:val="19"/>
-              </w:rPr>
-              <w:t>Đã hoàn thành xuất sắc (App.js)</w:t>
-            </w:r>
-          </w:p>
-        </w:tc>
-      </w:tr>
-      <w:tr>
-        <w:tc>
-          <w:tcPr>
-            <w:tcW w:type="dxa" w:w="3312"/>
-          </w:tcPr>
-          <w:p>
-            <w:pPr>
-              <w:spacing w:line="276" w:lineRule="auto" w:after="40"/>
-            </w:pPr>
-            <w:r>
-              <w:rPr>
-                <w:rFonts w:ascii="Times New Roman" w:hAnsi="Times New Roman"/>
-                <w:b/>
-                <w:sz w:val="19"/>
-              </w:rPr>
-              <w:t>Báo cáo &amp; Tài liệu</w:t>
-            </w:r>
-          </w:p>
-        </w:tc>
-        <w:tc>
-          <w:tcPr>
-            <w:tcW w:type="dxa" w:w="3312"/>
-          </w:tcPr>
-          <w:p>
-            <w:pPr>
-              <w:spacing w:line="276" w:lineRule="auto" w:after="40"/>
-            </w:pPr>
-            <w:r>
-              <w:rPr>
-                <w:rFonts w:ascii="Times New Roman" w:hAnsi="Times New Roman"/>
-                <w:sz w:val="19"/>
-              </w:rPr>
-              <w:t>Báo cáo chi tiết lý thuyết, mã nguồn và cập nhật README.md repository.</w:t>
-            </w:r>
-          </w:p>
-        </w:tc>
-        <w:tc>
-          <w:tcPr>
-            <w:tcW w:type="dxa" w:w="3312"/>
-          </w:tcPr>
-          <w:p>
-            <w:pPr>
-              <w:spacing w:line="276" w:lineRule="auto" w:after="40"/>
-            </w:pPr>
-            <w:r>
-              <w:rPr>
-                <w:rFonts w:ascii="Times New Roman" w:hAnsi="Times New Roman"/>
-                <w:sz w:val="19"/>
-              </w:rPr>
-              <w:t>Đã hoàn thành đầy đủ</w:t>
-            </w:r>
-          </w:p>
-        </w:tc>
-      </w:tr>
-    </w:tbl>
-    <w:p>
-      <w:pPr>
-        <w:spacing w:after="80"/>
-      </w:pPr>
-    </w:p>
-    <w:p>
-      <w:pPr>
-        <w:spacing w:before="200" w:after="60"/>
-      </w:pPr>
-      <w:r>
-        <w:rPr>
-          <w:rFonts w:ascii="Times New Roman" w:hAnsi="Times New Roman"/>
-          <w:b/>
-          <w:color w:val="0F172A"/>
-          <w:sz w:val="24"/>
-        </w:rPr>
-        <w:t>4. Cách chạy và kiểm tra ứng dụng thực hành</w:t>
-      </w:r>
-    </w:p>
-    <w:p>
-      <w:pPr>
-        <w:pStyle w:val="ListBullet"/>
-        <w:spacing w:after="60" w:line="276" w:lineRule="auto"/>
-      </w:pPr>
-      <w:r>
-        <w:rPr>
-          <w:rFonts w:ascii="Times New Roman" w:hAnsi="Times New Roman"/>
-          <w:b/>
-          <w:color w:val="0F172A"/>
-          <w:sz w:val="22"/>
-        </w:rPr>
-        <w:t xml:space="preserve">Bước 1: </w:t>
-      </w:r>
-      <w:r>
-        <w:rPr>
-          <w:rFonts w:ascii="Times New Roman" w:hAnsi="Times New Roman"/>
-          <w:color w:val="334155"/>
-          <w:sz w:val="22"/>
-        </w:rPr>
-        <w:t>Khởi động project React Native / Expo bằng lệnh: npx expo start.</w:t>
-      </w:r>
-    </w:p>
-    <w:p>
-      <w:pPr>
-        <w:pStyle w:val="ListBullet"/>
-        <w:spacing w:after="60" w:line="276" w:lineRule="auto"/>
-      </w:pPr>
-      <w:r>
-        <w:rPr>
-          <w:rFonts w:ascii="Times New Roman" w:hAnsi="Times New Roman"/>
-          <w:b/>
-          <w:color w:val="0F172A"/>
-          <w:sz w:val="22"/>
-        </w:rPr>
-        <w:t xml:space="preserve">Bước 2: </w:t>
-      </w:r>
-      <w:r>
-        <w:rPr>
-          <w:rFonts w:ascii="Times New Roman" w:hAnsi="Times New Roman"/>
-          <w:color w:val="334155"/>
-          <w:sz w:val="22"/>
-        </w:rPr>
-        <w:t>Mở ứng dụng trên điện thoại (quét QR Expo Go) hoặc trình giả lập Android Emulator.</w:t>
-      </w:r>
-    </w:p>
-    <w:p>
-      <w:pPr>
-        <w:pStyle w:val="ListBullet"/>
-        <w:spacing w:after="60" w:line="276" w:lineRule="auto"/>
-      </w:pPr>
-      <w:r>
-        <w:rPr>
-          <w:rFonts w:ascii="Times New Roman" w:hAnsi="Times New Roman"/>
-          <w:b/>
-          <w:color w:val="0F172A"/>
-          <w:sz w:val="22"/>
-        </w:rPr>
-        <w:t xml:space="preserve">Bước 3 (Kiểm tra Vòng đời): </w:t>
-      </w:r>
-      <w:r>
-        <w:rPr>
-          <w:rFonts w:ascii="Times New Roman" w:hAnsi="Times New Roman"/>
-          <w:color w:val="334155"/>
-          <w:sz w:val="22"/>
-        </w:rPr>
-        <w:t>Tại phần 1: Quan sát đồng hồ đếm thời gian chạy (Mounting). Bấm nút Kích hoạt Updating để kiểm tra state update. Bấm Ẩn Component để kích hoạt Unmounting và dọn dẹp timer.</w:t>
-      </w:r>
-    </w:p>
-    <w:p>
-      <w:pPr>
-        <w:pStyle w:val="ListBullet"/>
-        <w:spacing w:after="60" w:line="276" w:lineRule="auto"/>
-      </w:pPr>
-      <w:r>
-        <w:rPr>
-          <w:rFonts w:ascii="Times New Roman" w:hAnsi="Times New Roman"/>
-          <w:b/>
-          <w:color w:val="0F172A"/>
-          <w:sz w:val="22"/>
-        </w:rPr>
-        <w:t xml:space="preserve">Bước 4 (Kiểm tra Controlled Input): </w:t>
-      </w:r>
-      <w:r>
-        <w:rPr>
-          <w:rFonts w:ascii="Times New Roman" w:hAnsi="Times New Roman"/>
-          <w:color w:val="334155"/>
-          <w:sz w:val="22"/>
-        </w:rPr>
-        <w:t>Tại phần 2: Gõ văn bản vào ô TextInput và quan sát dòng preview cập nhật tức thì. Thử các nút Điền mẫu và Xóa nội dung.</w:t>
-      </w:r>
-    </w:p>
-    <w:p>
-      <w:pPr>
-        <w:pStyle w:val="ListBullet"/>
-        <w:spacing w:after="60" w:line="276" w:lineRule="auto"/>
-      </w:pPr>
-      <w:r>
-        <w:rPr>
-          <w:rFonts w:ascii="Times New Roman" w:hAnsi="Times New Roman"/>
-          <w:b/>
-          <w:color w:val="0F172A"/>
-          <w:sz w:val="22"/>
-        </w:rPr>
-        <w:t xml:space="preserve">Bước 5 (Kiểm tra Lồng Component): </w:t>
-      </w:r>
-      <w:r>
-        <w:rPr>
-          <w:rFonts w:ascii="Times New Roman" w:hAnsi="Times New Roman"/>
-          <w:color w:val="334155"/>
-          <w:sz w:val="22"/>
-        </w:rPr>
-        <w:t>Tại phần 3: Xem danh sách các card UserProfile hiển thị avatar bo tròn, thông tin sinh viên Bùi Duy Thành (12523080) và các bạn cùng lớp.</w:t>
-      </w:r>
-    </w:p>
-    <w:p>
-      <w:pPr>
-        <w:spacing w:before="280" w:after="80"/>
+        <w:spacing w:before="240" w:after="80"/>
       </w:pPr>
       <w:r>
         <w:rPr>
@@ -1799,76 +1082,7 @@
           <w:color w:val="334155"/>
           <w:sz w:val="22"/>
         </w:rPr>
-        <w:t>Qua bài học và bài thực hành Tuần 7, sinh viên đã nắm vững:</w:t>
-      </w:r>
-    </w:p>
-    <w:p>
-      <w:pPr>
-        <w:pStyle w:val="ListBullet"/>
-        <w:spacing w:after="60" w:line="276" w:lineRule="auto"/>
-      </w:pPr>
-      <w:r>
-        <w:rPr>
-          <w:rFonts w:ascii="Times New Roman" w:hAnsi="Times New Roman"/>
-          <w:b/>
-          <w:color w:val="0F172A"/>
-          <w:sz w:val="22"/>
-        </w:rPr>
-        <w:t xml:space="preserve">1. Quản lý Vòng đời: </w:t>
-      </w:r>
-      <w:r>
-        <w:rPr>
-          <w:rFonts w:ascii="Times New Roman" w:hAnsi="Times New Roman"/>
-          <w:color w:val="334155"/>
-          <w:sz w:val="22"/>
-        </w:rPr>
-        <w:t>Hiểu sâu sắc 3 giai đoạn của vòng đời Component (Mounting, Updating, Unmounting), cơ chế vận hành của useEffect và tầm quan trọng của cleanup function trong việc phòng ngừa rò rỉ bộ nhớ (memory leaks).</w:t>
-      </w:r>
-    </w:p>
-    <w:p>
-      <w:pPr>
-        <w:pStyle w:val="ListBullet"/>
-        <w:spacing w:after="60" w:line="276" w:lineRule="auto"/>
-      </w:pPr>
-      <w:r>
-        <w:rPr>
-          <w:rFonts w:ascii="Times New Roman" w:hAnsi="Times New Roman"/>
-          <w:b/>
-          <w:color w:val="0F172A"/>
-          <w:sz w:val="22"/>
-        </w:rPr>
-        <w:t xml:space="preserve">2. Controlled Component: </w:t>
-      </w:r>
-      <w:r>
-        <w:rPr>
-          <w:rFonts w:ascii="Times New Roman" w:hAnsi="Times New Roman"/>
-          <w:color w:val="334155"/>
-          <w:sz w:val="22"/>
-        </w:rPr>
-        <w:t>Làm chủ kỹ thuật Controlled Component, hiểu rõ lợi ích của việc lấy React state làm nguồn chân lý duy nhất (Single Source of Truth) để phục vụ cho các bài toán form phức tạp, kiểm tra tính hợp lệ và phản hồi người dùng.</w:t>
-      </w:r>
-    </w:p>
-    <w:p>
-      <w:pPr>
-        <w:pStyle w:val="ListBullet"/>
-        <w:spacing w:after="60" w:line="276" w:lineRule="auto"/>
-      </w:pPr>
-      <w:r>
-        <w:rPr>
-          <w:rFonts w:ascii="Times New Roman" w:hAnsi="Times New Roman"/>
-          <w:b/>
-          <w:color w:val="0F172A"/>
-          <w:sz w:val="22"/>
-        </w:rPr>
-        <w:t xml:space="preserve">3. Cấu trúc Lồng Component: </w:t>
-      </w:r>
-      <w:r>
-        <w:rPr>
-          <w:rFonts w:ascii="Times New Roman" w:hAnsi="Times New Roman"/>
-          <w:color w:val="334155"/>
-          <w:sz w:val="22"/>
-        </w:rPr>
-        <w:t>Rèn luyện tư duy thiết kế phần mềm hướng Component, biết cách chia nhỏ giao diện, lồng ghép các component con (Avatar) vào component cha (UserProfile) và truyền dữ liệu props linh hoạt, chuẩn mực.</w:t>
+        <w:t>Sinh viên Bùi Duy Thành (MSV: 12523080) đã hoàn thành xuất sắc toàn bộ yêu cầu thực hành Buổi 07: xây dựng màn hình Home clone hoàn chỉnh, ứng dụng triệt để Controlled Component, quản lý Vòng đời Component và tối ưu hóa FlatList chuẩn responsive trên cả 2 chế độ hiển thị dọc và ngang. Sản phẩm đã sẵn sàng nộp bài với tag git: buoi7.</w:t>
       </w:r>
     </w:p>
     <w:sectPr>

</xml_diff>